<commit_message>
trup: credit recordings to Boruch Green (used with permission) - relabel 'Your Voice' in trup-real + archived clarinet-lab, fix handoff md/docx; identify 'pashta katon' as a WhatsApp Opus voice note (pashta into zakef katon) and add it
</commit_message>
<xml_diff>
--- a/dev/trup/TRUP-HANDOFF.docx
+++ b/dev/trup/TRUP-HANDOFF.docx
@@ -228,10 +228,10 @@
                 <w:b/>
                 <w:bCs/>
               </w:rPr>
-              <w:t xml:space="preserve">Your Voice</w:t>
-            </w:r>
-            <w:r>
-              <w:t xml:space="preserve"> (Mordy's 10 own-voice recordings = ground truth for the yeshivish cell, embedded mp3) and a proof-of-scale </w:t>
+              <w:t xml:space="preserve">Boruch Green</w:t>
+            </w:r>
+            <w:r>
+              <w:t xml:space="preserve"> (10 trope-name recordings by Boruch Green, used with permission = ground truth for the yeshivish cell, embedded mp3) and a proof-of-scale </w:t>
             </w:r>
             <w:r>
               <w:rPr>
@@ -281,7 +281,7 @@
               <w:t xml:space="preserve">CLARINET</w:t>
             </w:r>
             <w:r>
-              <w:t xml:space="preserve"> (discrete notes) — he dislikes pitch “slope”/glide (secondary toggle only). Own-voice keeps embedded audio; measured-from-source tropes are </w:t>
+              <w:t xml:space="preserve"> (discrete notes) — he dislikes pitch “slope”/glide (secondary toggle only). Boruch Green's recordings (used with permission) keep embedded audio; measured-from-source tropes are </w:t>
             </w:r>
             <w:r>
               <w:rPr>
@@ -595,7 +595,7 @@
         <w:t xml:space="preserve">Where we are in the matrix: </w:t>
       </w:r>
       <w:r>
-        <w:t xml:space="preserve">one community (Ashkenazi, via Mordy's own voice as ground truth + a full PocketTorah proof-set) across two reading-types (Torah, Haftarah). Everything else is open — and reachable with the pipeline below.</w:t>
+        <w:t xml:space="preserve">one community (Ashkenazi, via Boruch Green's recordings as ground truth + a full PocketTorah proof-set) across two reading-types (Torah, Haftarah). Everything else is open — and reachable with the pipeline below.</w:t>
       </w:r>
     </w:p>
     <w:p>
@@ -782,7 +782,7 @@
                 <w:sz w:val="20"/>
                 <w:szCs w:val="20"/>
               </w:rPr>
-              <w:t xml:space="preserve">Your Voice</w:t>
+              <w:t xml:space="preserve">Boruch Green</w:t>
             </w:r>
           </w:p>
         </w:tc>
@@ -836,7 +836,7 @@
                 <w:sz w:val="20"/>
                 <w:szCs w:val="20"/>
               </w:rPr>
-              <w:t xml:space="preserve">Mordy's own recordings — ground truth for the yeshivish cell</w:t>
+              <w:t xml:space="preserve">Boruch Green's recordings (used with permission) — ground truth for the yeshivish cell</w:t>
             </w:r>
           </w:p>
         </w:tc>
@@ -1381,7 +1381,7 @@
                 <w:sz w:val="20"/>
                 <w:szCs w:val="20"/>
               </w:rPr>
-              <w:t xml:space="preserve">GPT's origin file — embeds Mordy's 10 own-voice mp3s + librosa contours. Archive/reference.</w:t>
+              <w:t xml:space="preserve">GPT's origin file — embeds Boruch Green's 10 trope-name mp3s + librosa contours. Archive/reference.</w:t>
             </w:r>
           </w:p>
         </w:tc>
@@ -1755,7 +1755,7 @@
         <w:t xml:space="preserve">Recordings layer is link-only</w:t>
       </w:r>
       <w:r>
-        <w:t xml:space="preserve"> — rights stay with the source (own-voice is the embedded exception). Applies to every community's audio.</w:t>
+        <w:t xml:space="preserve"> — rights stay with the source (Boruch Green's recordings, used with permission, are the embedded exception). Applies to every community's audio.</w:t>
       </w:r>
     </w:p>
     <w:p>
@@ -1896,7 +1896,7 @@
         <w:t xml:space="preserve">Add communities, each measured from real recordings: </w:t>
       </w:r>
       <w:r>
-        <w:t xml:space="preserve">Litvish (Mordy's own voice or Virtual Cantor), Sephardic (S&amp;P, Moroccan), Yemenite, Mizrahi (Syrian/Iraqi via the Sephardic Pizmonim Project), Italian. Sources must be CORS-reachable or uploaded.</w:t>
+        <w:t xml:space="preserve">Litvish (Boruch Green's full set — 23 Torah + 21 haftorah tropes, already in dev/trup/own-voice — or Virtual Cantor), Sephardic (S&amp;P, Moroccan), Yemenite, Mizrahi (Syrian/Iraqi via the Sephardic Pizmonim Project), Italian. Sources must be CORS-reachable or uploaded.</w:t>
       </w:r>
     </w:p>
     <w:p>

</xml_diff>